<commit_message>
Update the pre_processing notebook and suertes_clean
</commit_message>
<xml_diff>
--- a/others/Datos Generales Proyecto Final.docx
+++ b/others/Datos Generales Proyecto Final.docx
@@ -183,16 +183,28 @@
           <w:numId w:val="2"/>
         </w:numPr>
       </w:pPr>
-      <w:r>
-        <w:rPr>
-          <w:b/>
-          <w:bCs/>
-        </w:rPr>
-        <w:t>Dist Km</w:t>
+      <w:proofErr w:type="spellStart"/>
+      <w:r>
+        <w:rPr>
+          <w:b/>
+          <w:bCs/>
+        </w:rPr>
+        <w:t>Dist</w:t>
+      </w:r>
+      <w:proofErr w:type="spellEnd"/>
+      <w:r>
+        <w:rPr>
+          <w:b/>
+          <w:bCs/>
+        </w:rPr>
+        <w:t xml:space="preserve"> Km</w:t>
       </w:r>
       <w:r>
         <w:t>: Distancia a la planta de procesamiento o punto de recolección.</w:t>
       </w:r>
+      <w:r>
+        <w:t xml:space="preserve"> Asociado con la hacienda.</w:t>
+      </w:r>
     </w:p>
     <w:p>
       <w:pPr>
@@ -219,16 +231,26 @@
           <w:numId w:val="2"/>
         </w:numPr>
       </w:pPr>
-      <w:r>
-        <w:rPr>
-          <w:b/>
-          <w:bCs/>
-        </w:rPr>
-        <w:t>Cod.Estado #</w:t>
+      <w:proofErr w:type="spellStart"/>
+      <w:r>
+        <w:rPr>
+          <w:b/>
+          <w:bCs/>
+        </w:rPr>
+        <w:t>Cod.Estado</w:t>
+      </w:r>
+      <w:proofErr w:type="spellEnd"/>
+      <w:r>
+        <w:rPr>
+          <w:b/>
+          <w:bCs/>
+        </w:rPr>
+        <w:t xml:space="preserve"> #</w:t>
       </w:r>
       <w:r>
         <w:t xml:space="preserve"> y </w:t>
       </w:r>
+      <w:proofErr w:type="spellStart"/>
       <w:r>
         <w:rPr>
           <w:b/>
@@ -236,8 +258,32 @@
         </w:rPr>
         <w:t>Cod.Estado</w:t>
       </w:r>
-      <w:r>
-        <w:t>: Código que indica el estado del cultivo.</w:t>
+      <w:proofErr w:type="spellEnd"/>
+      <w:r>
+        <w:t xml:space="preserve">: Código que indica el estado </w:t>
+      </w:r>
+      <w:r>
+        <w:t xml:space="preserve">o situación </w:t>
+      </w:r>
+      <w:r>
+        <w:t xml:space="preserve">del </w:t>
+      </w:r>
+      <w:proofErr w:type="gramStart"/>
+      <w:r>
+        <w:t>cultivo.</w:t>
+      </w:r>
+      <w:r>
+        <w:t xml:space="preserve"> </w:t>
+      </w:r>
+      <w:r>
+        <w:t xml:space="preserve"> </w:t>
+      </w:r>
+      <w:r>
+        <w:t>.</w:t>
+      </w:r>
+      <w:proofErr w:type="gramEnd"/>
+      <w:r>
+        <w:t xml:space="preserve"> </w:t>
       </w:r>
     </w:p>
     <w:p>
@@ -247,6 +293,8 @@
           <w:numId w:val="2"/>
         </w:numPr>
       </w:pPr>
+      <w:proofErr w:type="spellStart"/>
+      <w:proofErr w:type="gramStart"/>
       <w:r>
         <w:rPr>
           <w:b/>
@@ -254,6 +302,8 @@
         </w:rPr>
         <w:t>F.Siembra</w:t>
       </w:r>
+      <w:proofErr w:type="spellEnd"/>
+      <w:proofErr w:type="gramEnd"/>
       <w:r>
         <w:t>: Fecha de siembra del cultivo.</w:t>
       </w:r>
@@ -283,6 +333,7 @@
           <w:numId w:val="2"/>
         </w:numPr>
       </w:pPr>
+      <w:proofErr w:type="spellStart"/>
       <w:r>
         <w:rPr>
           <w:b/>
@@ -290,6 +341,7 @@
         </w:rPr>
         <w:t>Ult.Riego</w:t>
       </w:r>
+      <w:proofErr w:type="spellEnd"/>
       <w:r>
         <w:t>: Última fecha en la que se regó el cultivo.</w:t>
       </w:r>
@@ -306,7 +358,23 @@
           <w:b/>
           <w:bCs/>
         </w:rPr>
-        <w:t>Edad Ult Cos</w:t>
+        <w:t xml:space="preserve">Edad </w:t>
+      </w:r>
+      <w:proofErr w:type="spellStart"/>
+      <w:r>
+        <w:rPr>
+          <w:b/>
+          <w:bCs/>
+        </w:rPr>
+        <w:t>Ult</w:t>
+      </w:r>
+      <w:proofErr w:type="spellEnd"/>
+      <w:r>
+        <w:rPr>
+          <w:b/>
+          <w:bCs/>
+        </w:rPr>
+        <w:t xml:space="preserve"> Cos</w:t>
       </w:r>
       <w:r>
         <w:t>: Edad del cultivo en el último corte.</w:t>
@@ -319,6 +387,8 @@
           <w:numId w:val="2"/>
         </w:numPr>
       </w:pPr>
+      <w:proofErr w:type="spellStart"/>
+      <w:proofErr w:type="gramStart"/>
       <w:r>
         <w:rPr>
           <w:b/>
@@ -326,6 +396,8 @@
         </w:rPr>
         <w:t>F.Ult.Corte</w:t>
       </w:r>
+      <w:proofErr w:type="spellEnd"/>
+      <w:proofErr w:type="gramEnd"/>
       <w:r>
         <w:t>: Fecha del último corte realizado en el lote.</w:t>
       </w:r>
@@ -375,8 +447,19 @@
           <w:b/>
           <w:bCs/>
         </w:rPr>
-        <w:t>Cod. T.Cultivo</w:t>
-      </w:r>
+        <w:t xml:space="preserve">Cod. </w:t>
+      </w:r>
+      <w:proofErr w:type="spellStart"/>
+      <w:proofErr w:type="gramStart"/>
+      <w:r>
+        <w:rPr>
+          <w:b/>
+          <w:bCs/>
+        </w:rPr>
+        <w:t>T.Cultivo</w:t>
+      </w:r>
+      <w:proofErr w:type="spellEnd"/>
+      <w:proofErr w:type="gramEnd"/>
       <w:r>
         <w:t>: Código del tipo de cultivo.</w:t>
       </w:r>
@@ -406,12 +489,21 @@
           <w:numId w:val="3"/>
         </w:numPr>
       </w:pPr>
-      <w:r>
-        <w:rPr>
-          <w:b/>
-          <w:bCs/>
-        </w:rPr>
-        <w:t>Fec.Madur.</w:t>
+      <w:proofErr w:type="spellStart"/>
+      <w:r>
+        <w:rPr>
+          <w:b/>
+          <w:bCs/>
+        </w:rPr>
+        <w:t>Fec.Madur</w:t>
+      </w:r>
+      <w:proofErr w:type="spellEnd"/>
+      <w:r>
+        <w:rPr>
+          <w:b/>
+          <w:bCs/>
+        </w:rPr>
+        <w:t>.</w:t>
       </w:r>
       <w:r>
         <w:t>: Fecha estimada de maduración de la caña.</w:t>
@@ -465,7 +557,23 @@
           <w:b/>
           <w:bCs/>
         </w:rPr>
-        <w:t>Semanas mad.</w:t>
+        <w:t xml:space="preserve">Semanas </w:t>
+      </w:r>
+      <w:proofErr w:type="spellStart"/>
+      <w:r>
+        <w:rPr>
+          <w:b/>
+          <w:bCs/>
+        </w:rPr>
+        <w:t>mad</w:t>
+      </w:r>
+      <w:proofErr w:type="spellEnd"/>
+      <w:r>
+        <w:rPr>
+          <w:b/>
+          <w:bCs/>
+        </w:rPr>
+        <w:t>.</w:t>
       </w:r>
       <w:r>
         <w:t>: Número de semanas de maduración.</w:t>
@@ -478,6 +586,7 @@
           <w:numId w:val="3"/>
         </w:numPr>
       </w:pPr>
+      <w:proofErr w:type="spellStart"/>
       <w:r>
         <w:rPr>
           <w:b/>
@@ -485,6 +594,7 @@
         </w:rPr>
         <w:t>TonUltCorte</w:t>
       </w:r>
+      <w:proofErr w:type="spellEnd"/>
       <w:r>
         <w:t>: Toneladas cosechadas en el último corte.</w:t>
       </w:r>
@@ -533,6 +643,7 @@
           <w:numId w:val="3"/>
         </w:numPr>
       </w:pPr>
+      <w:proofErr w:type="spellStart"/>
       <w:r>
         <w:rPr>
           <w:b/>
@@ -540,6 +651,7 @@
         </w:rPr>
         <w:t>Ton.Azucar</w:t>
       </w:r>
+      <w:proofErr w:type="spellEnd"/>
       <w:r>
         <w:t>: Toneladas de azúcar obtenidas en la cosecha.</w:t>
       </w:r>
@@ -551,6 +663,7 @@
           <w:numId w:val="3"/>
         </w:numPr>
       </w:pPr>
+      <w:proofErr w:type="spellStart"/>
       <w:r>
         <w:rPr>
           <w:b/>
@@ -558,6 +671,7 @@
         </w:rPr>
         <w:t>Rdto</w:t>
       </w:r>
+      <w:proofErr w:type="spellEnd"/>
       <w:r>
         <w:t>: Rendimiento del cultivo.</w:t>
       </w:r>
@@ -620,12 +734,21 @@
           <w:numId w:val="4"/>
         </w:numPr>
       </w:pPr>
-      <w:r>
-        <w:rPr>
-          <w:b/>
-          <w:bCs/>
-        </w:rPr>
-        <w:t>Sac.Caña Precosecha</w:t>
+      <w:proofErr w:type="spellStart"/>
+      <w:r>
+        <w:rPr>
+          <w:b/>
+          <w:bCs/>
+        </w:rPr>
+        <w:t>Sac.Caña</w:t>
+      </w:r>
+      <w:proofErr w:type="spellEnd"/>
+      <w:r>
+        <w:rPr>
+          <w:b/>
+          <w:bCs/>
+        </w:rPr>
+        <w:t xml:space="preserve"> Precosecha</w:t>
       </w:r>
       <w:r>
         <w:t>: Sacarosa en la caña antes de la cosecha.</w:t>
@@ -638,6 +761,7 @@
           <w:numId w:val="4"/>
         </w:numPr>
       </w:pPr>
+      <w:proofErr w:type="spellStart"/>
       <w:r>
         <w:rPr>
           <w:b/>
@@ -645,6 +769,7 @@
         </w:rPr>
         <w:t>Edad.Precosecha</w:t>
       </w:r>
+      <w:proofErr w:type="spellEnd"/>
       <w:r>
         <w:t>: Edad de la caña antes de la cosecha.</w:t>
       </w:r>
@@ -661,8 +786,17 @@
           <w:b/>
           <w:bCs/>
         </w:rPr>
-        <w:t>%Sac.Caña</w:t>
-      </w:r>
+        <w:t>%</w:t>
+      </w:r>
+      <w:proofErr w:type="spellStart"/>
+      <w:r>
+        <w:rPr>
+          <w:b/>
+          <w:bCs/>
+        </w:rPr>
+        <w:t>Sac.Caña</w:t>
+      </w:r>
+      <w:proofErr w:type="spellEnd"/>
       <w:r>
         <w:t>: Porcentaje de sacarosa en la caña.</w:t>
       </w:r>
@@ -679,8 +813,17 @@
           <w:b/>
           <w:bCs/>
         </w:rPr>
-        <w:t>%Sac.Muestreadora</w:t>
-      </w:r>
+        <w:t>%</w:t>
+      </w:r>
+      <w:proofErr w:type="spellStart"/>
+      <w:r>
+        <w:rPr>
+          <w:b/>
+          <w:bCs/>
+        </w:rPr>
+        <w:t>Sac.Muestreadora</w:t>
+      </w:r>
+      <w:proofErr w:type="spellEnd"/>
       <w:r>
         <w:t>: Porcentaje de sacarosa medido por muestreo.</w:t>
       </w:r>
@@ -779,8 +922,17 @@
           <w:b/>
           <w:bCs/>
         </w:rPr>
-        <w:t>%ME Veg</w:t>
-      </w:r>
+        <w:t xml:space="preserve">%ME </w:t>
+      </w:r>
+      <w:proofErr w:type="spellStart"/>
+      <w:r>
+        <w:rPr>
+          <w:b/>
+          <w:bCs/>
+        </w:rPr>
+        <w:t>Veg</w:t>
+      </w:r>
+      <w:proofErr w:type="spellEnd"/>
       <w:r>
         <w:t>: Materia extraña de origen mineral y vegetal.</w:t>
       </w:r>
@@ -897,6 +1049,8 @@
           <w:numId w:val="5"/>
         </w:numPr>
       </w:pPr>
+      <w:proofErr w:type="spellStart"/>
+      <w:proofErr w:type="gramStart"/>
       <w:r>
         <w:rPr>
           <w:b/>
@@ -904,6 +1058,8 @@
         </w:rPr>
         <w:t>T.Corte</w:t>
       </w:r>
+      <w:proofErr w:type="spellEnd"/>
+      <w:proofErr w:type="gramEnd"/>
       <w:r>
         <w:t>: Tipo de corte realizado (manual o mecanizado).</w:t>
       </w:r>
@@ -951,6 +1107,7 @@
           <w:numId w:val="5"/>
         </w:numPr>
       </w:pPr>
+      <w:proofErr w:type="spellStart"/>
       <w:r>
         <w:rPr>
           <w:b/>
@@ -958,6 +1115,7 @@
         </w:rPr>
         <w:t>Num.Riegos</w:t>
       </w:r>
+      <w:proofErr w:type="spellEnd"/>
       <w:r>
         <w:t>: Número de riegos aplicados.</w:t>
       </w:r>
@@ -987,6 +1145,7 @@
           <w:numId w:val="5"/>
         </w:numPr>
       </w:pPr>
+      <w:proofErr w:type="spellStart"/>
       <w:r>
         <w:rPr>
           <w:b/>
@@ -994,6 +1153,7 @@
         </w:rPr>
         <w:t>DDUlt.Riego</w:t>
       </w:r>
+      <w:proofErr w:type="spellEnd"/>
       <w:r>
         <w:t>: Días desde el último riego.</w:t>
       </w:r>
@@ -1025,7 +1185,23 @@
           <w:b/>
           <w:bCs/>
         </w:rPr>
-        <w:t>Lluvias (2 Meses Ant.)</w:t>
+        <w:t xml:space="preserve">Lluvias (2 Meses </w:t>
+      </w:r>
+      <w:proofErr w:type="spellStart"/>
+      <w:r>
+        <w:rPr>
+          <w:b/>
+          <w:bCs/>
+        </w:rPr>
+        <w:t>Ant</w:t>
+      </w:r>
+      <w:proofErr w:type="spellEnd"/>
+      <w:r>
+        <w:rPr>
+          <w:b/>
+          <w:bCs/>
+        </w:rPr>
+        <w:t>.)</w:t>
       </w:r>
       <w:r>
         <w:t>: Precipitaciones en los dos meses previos a la cosecha.</w:t>
@@ -1134,10 +1310,27 @@
           <w:b/>
           <w:bCs/>
         </w:rPr>
-        <w:t>%Infest.Diatrea</w:t>
-      </w:r>
-      <w:r>
-        <w:t>: Nivel de infestación por Diatraea, un insecto plaga.</w:t>
+        <w:t>%</w:t>
+      </w:r>
+      <w:proofErr w:type="spellStart"/>
+      <w:r>
+        <w:rPr>
+          <w:b/>
+          <w:bCs/>
+        </w:rPr>
+        <w:t>Infest.Diatrea</w:t>
+      </w:r>
+      <w:proofErr w:type="spellEnd"/>
+      <w:r>
+        <w:t xml:space="preserve">: Nivel de infestación por </w:t>
+      </w:r>
+      <w:proofErr w:type="spellStart"/>
+      <w:r>
+        <w:t>Diatraea</w:t>
+      </w:r>
+      <w:proofErr w:type="spellEnd"/>
+      <w:r>
+        <w:t>, un insecto plaga.</w:t>
       </w:r>
     </w:p>
     <w:p>
@@ -1180,12 +1373,21 @@
           <w:numId w:val="7"/>
         </w:numPr>
       </w:pPr>
-      <w:r>
-        <w:rPr>
-          <w:b/>
-          <w:bCs/>
-        </w:rPr>
-        <w:t>Fert.Nitrogen.</w:t>
+      <w:proofErr w:type="spellStart"/>
+      <w:r>
+        <w:rPr>
+          <w:b/>
+          <w:bCs/>
+        </w:rPr>
+        <w:t>Fert.Nitrogen</w:t>
+      </w:r>
+      <w:proofErr w:type="spellEnd"/>
+      <w:r>
+        <w:rPr>
+          <w:b/>
+          <w:bCs/>
+        </w:rPr>
+        <w:t>.</w:t>
       </w:r>
       <w:r>
         <w:t>: Nivel de fertilización con nitrógeno.</w:t>
@@ -1231,11 +1433,28 @@
           <w:b/>
           <w:bCs/>
         </w:rPr>
-        <w:t>Boro Granul.</w:t>
+        <w:t xml:space="preserve">Boro </w:t>
+      </w:r>
+      <w:proofErr w:type="spellStart"/>
+      <w:r>
+        <w:rPr>
+          <w:b/>
+          <w:bCs/>
+        </w:rPr>
+        <w:t>Granul</w:t>
+      </w:r>
+      <w:proofErr w:type="spellEnd"/>
+      <w:r>
+        <w:rPr>
+          <w:b/>
+          <w:bCs/>
+        </w:rPr>
+        <w:t>.</w:t>
       </w:r>
       <w:r>
         <w:t xml:space="preserve">, </w:t>
       </w:r>
+      <w:proofErr w:type="spellStart"/>
       <w:r>
         <w:rPr>
           <w:b/>
@@ -1243,6 +1462,7 @@
         </w:rPr>
         <w:t>MicroZinc</w:t>
       </w:r>
+      <w:proofErr w:type="spellEnd"/>
       <w:r>
         <w:t xml:space="preserve">, </w:t>
       </w:r>
@@ -1256,6 +1476,7 @@
       <w:r>
         <w:t xml:space="preserve">, </w:t>
       </w:r>
+      <w:proofErr w:type="spellStart"/>
       <w:r>
         <w:rPr>
           <w:b/>
@@ -1263,6 +1484,7 @@
         </w:rPr>
         <w:t>Sul.Amonio</w:t>
       </w:r>
+      <w:proofErr w:type="spellEnd"/>
       <w:r>
         <w:t xml:space="preserve">, </w:t>
       </w:r>
@@ -1309,13 +1531,31 @@
           <w:numId w:val="8"/>
         </w:numPr>
       </w:pPr>
-      <w:r>
-        <w:rPr>
-          <w:b/>
-          <w:bCs/>
-        </w:rPr>
-        <w:t>Codigo Estacion</w:t>
-      </w:r>
+      <w:proofErr w:type="spellStart"/>
+      <w:r>
+        <w:rPr>
+          <w:b/>
+          <w:bCs/>
+        </w:rPr>
+        <w:t>Codigo</w:t>
+      </w:r>
+      <w:proofErr w:type="spellEnd"/>
+      <w:r>
+        <w:rPr>
+          <w:b/>
+          <w:bCs/>
+        </w:rPr>
+        <w:t xml:space="preserve"> </w:t>
+      </w:r>
+      <w:proofErr w:type="spellStart"/>
+      <w:r>
+        <w:rPr>
+          <w:b/>
+          <w:bCs/>
+        </w:rPr>
+        <w:t>Estacion</w:t>
+      </w:r>
+      <w:proofErr w:type="spellEnd"/>
       <w:r>
         <w:t>: Código de la estación meteorológica asociada.</w:t>
       </w:r>
@@ -1327,12 +1567,21 @@
           <w:numId w:val="8"/>
         </w:numPr>
       </w:pPr>
-      <w:r>
-        <w:rPr>
-          <w:b/>
-          <w:bCs/>
-        </w:rPr>
-        <w:t>Temp. Media 0-3</w:t>
+      <w:proofErr w:type="spellStart"/>
+      <w:r>
+        <w:rPr>
+          <w:b/>
+          <w:bCs/>
+        </w:rPr>
+        <w:t>Temp</w:t>
+      </w:r>
+      <w:proofErr w:type="spellEnd"/>
+      <w:r>
+        <w:rPr>
+          <w:b/>
+          <w:bCs/>
+        </w:rPr>
+        <w:t>. Media 0-3</w:t>
       </w:r>
       <w:r>
         <w:t>: Temperatura media en los últimos 0 a 3 meses.</w:t>
@@ -1345,12 +1594,21 @@
           <w:numId w:val="8"/>
         </w:numPr>
       </w:pPr>
-      <w:r>
-        <w:rPr>
-          <w:b/>
-          <w:bCs/>
-        </w:rPr>
-        <w:t>Temp. Media Ciclo</w:t>
+      <w:proofErr w:type="spellStart"/>
+      <w:r>
+        <w:rPr>
+          <w:b/>
+          <w:bCs/>
+        </w:rPr>
+        <w:t>Temp</w:t>
+      </w:r>
+      <w:proofErr w:type="spellEnd"/>
+      <w:r>
+        <w:rPr>
+          <w:b/>
+          <w:bCs/>
+        </w:rPr>
+        <w:t>. Media Ciclo</w:t>
       </w:r>
       <w:r>
         <w:t>: Temperatura media durante todo el ciclo del cultivo.</w:t>
@@ -1363,12 +1621,21 @@
           <w:numId w:val="8"/>
         </w:numPr>
       </w:pPr>
-      <w:r>
-        <w:rPr>
-          <w:b/>
-          <w:bCs/>
-        </w:rPr>
-        <w:t>Temp Max Ciclo</w:t>
+      <w:proofErr w:type="spellStart"/>
+      <w:r>
+        <w:rPr>
+          <w:b/>
+          <w:bCs/>
+        </w:rPr>
+        <w:t>Temp</w:t>
+      </w:r>
+      <w:proofErr w:type="spellEnd"/>
+      <w:r>
+        <w:rPr>
+          <w:b/>
+          <w:bCs/>
+        </w:rPr>
+        <w:t xml:space="preserve"> Max Ciclo</w:t>
       </w:r>
       <w:r>
         <w:t>: Temperatura máxima registrada durante el ciclo.</w:t>
@@ -1381,12 +1648,21 @@
           <w:numId w:val="8"/>
         </w:numPr>
       </w:pPr>
-      <w:r>
-        <w:rPr>
-          <w:b/>
-          <w:bCs/>
-        </w:rPr>
-        <w:t>Temp Min Ciclo</w:t>
+      <w:proofErr w:type="spellStart"/>
+      <w:r>
+        <w:rPr>
+          <w:b/>
+          <w:bCs/>
+        </w:rPr>
+        <w:t>Temp</w:t>
+      </w:r>
+      <w:proofErr w:type="spellEnd"/>
+      <w:r>
+        <w:rPr>
+          <w:b/>
+          <w:bCs/>
+        </w:rPr>
+        <w:t xml:space="preserve"> Min Ciclo</w:t>
       </w:r>
       <w:r>
         <w:t>: Temperatura mínima registrada.</w:t>
@@ -1404,7 +1680,23 @@
           <w:b/>
           <w:bCs/>
         </w:rPr>
-        <w:t>Humedad Rel Media 0-3</w:t>
+        <w:t xml:space="preserve">Humedad </w:t>
+      </w:r>
+      <w:proofErr w:type="spellStart"/>
+      <w:r>
+        <w:rPr>
+          <w:b/>
+          <w:bCs/>
+        </w:rPr>
+        <w:t>Rel</w:t>
+      </w:r>
+      <w:proofErr w:type="spellEnd"/>
+      <w:r>
+        <w:rPr>
+          <w:b/>
+          <w:bCs/>
+        </w:rPr>
+        <w:t xml:space="preserve"> Media 0-3</w:t>
       </w:r>
       <w:r>
         <w:t>: Humedad relativa media en los últimos 3 meses.</w:t>
@@ -1422,7 +1714,23 @@
           <w:b/>
           <w:bCs/>
         </w:rPr>
-        <w:t>Humedad Rel Media Ciclo</w:t>
+        <w:t xml:space="preserve">Humedad </w:t>
+      </w:r>
+      <w:proofErr w:type="spellStart"/>
+      <w:r>
+        <w:rPr>
+          <w:b/>
+          <w:bCs/>
+        </w:rPr>
+        <w:t>Rel</w:t>
+      </w:r>
+      <w:proofErr w:type="spellEnd"/>
+      <w:r>
+        <w:rPr>
+          <w:b/>
+          <w:bCs/>
+        </w:rPr>
+        <w:t xml:space="preserve"> Media Ciclo</w:t>
       </w:r>
       <w:r>
         <w:t>: Humedad relativa promedio del ciclo.</w:t>
@@ -1435,12 +1743,53 @@
           <w:numId w:val="8"/>
         </w:numPr>
       </w:pPr>
-      <w:r>
-        <w:rPr>
-          <w:b/>
-          <w:bCs/>
-        </w:rPr>
-        <w:t>Oscilacion Temp Med 0-3</w:t>
+      <w:proofErr w:type="spellStart"/>
+      <w:r>
+        <w:rPr>
+          <w:b/>
+          <w:bCs/>
+        </w:rPr>
+        <w:t>Oscilacion</w:t>
+      </w:r>
+      <w:proofErr w:type="spellEnd"/>
+      <w:r>
+        <w:rPr>
+          <w:b/>
+          <w:bCs/>
+        </w:rPr>
+        <w:t xml:space="preserve"> </w:t>
+      </w:r>
+      <w:proofErr w:type="spellStart"/>
+      <w:r>
+        <w:rPr>
+          <w:b/>
+          <w:bCs/>
+        </w:rPr>
+        <w:t>Temp</w:t>
+      </w:r>
+      <w:proofErr w:type="spellEnd"/>
+      <w:r>
+        <w:rPr>
+          <w:b/>
+          <w:bCs/>
+        </w:rPr>
+        <w:t xml:space="preserve"> </w:t>
+      </w:r>
+      <w:proofErr w:type="spellStart"/>
+      <w:r>
+        <w:rPr>
+          <w:b/>
+          <w:bCs/>
+        </w:rPr>
+        <w:t>Med</w:t>
+      </w:r>
+      <w:proofErr w:type="spellEnd"/>
+      <w:r>
+        <w:rPr>
+          <w:b/>
+          <w:bCs/>
+        </w:rPr>
+        <w:t xml:space="preserve"> 0-3</w:t>
       </w:r>
       <w:r>
         <w:t>: Variabilidad de la temperatura en los últimos 3 meses.</w:t>
@@ -1453,12 +1802,37 @@
           <w:numId w:val="8"/>
         </w:numPr>
       </w:pPr>
-      <w:r>
-        <w:rPr>
-          <w:b/>
-          <w:bCs/>
-        </w:rPr>
-        <w:t>Oscilacion Temp Ciclo</w:t>
+      <w:proofErr w:type="spellStart"/>
+      <w:r>
+        <w:rPr>
+          <w:b/>
+          <w:bCs/>
+        </w:rPr>
+        <w:t>Oscilacion</w:t>
+      </w:r>
+      <w:proofErr w:type="spellEnd"/>
+      <w:r>
+        <w:rPr>
+          <w:b/>
+          <w:bCs/>
+        </w:rPr>
+        <w:t xml:space="preserve"> </w:t>
+      </w:r>
+      <w:proofErr w:type="spellStart"/>
+      <w:r>
+        <w:rPr>
+          <w:b/>
+          <w:bCs/>
+        </w:rPr>
+        <w:t>Temp</w:t>
+      </w:r>
+      <w:proofErr w:type="spellEnd"/>
+      <w:r>
+        <w:rPr>
+          <w:b/>
+          <w:bCs/>
+        </w:rPr>
+        <w:t xml:space="preserve"> Ciclo</w:t>
       </w:r>
       <w:r>
         <w:t>: Variabilidad de la temperatura en todo el ciclo.</w:t>
@@ -1476,7 +1850,39 @@
           <w:b/>
           <w:bCs/>
         </w:rPr>
-        <w:t>Sum Oscilacion Temp Ciclo</w:t>
+        <w:t xml:space="preserve">Sum </w:t>
+      </w:r>
+      <w:proofErr w:type="spellStart"/>
+      <w:r>
+        <w:rPr>
+          <w:b/>
+          <w:bCs/>
+        </w:rPr>
+        <w:t>Oscilacion</w:t>
+      </w:r>
+      <w:proofErr w:type="spellEnd"/>
+      <w:r>
+        <w:rPr>
+          <w:b/>
+          <w:bCs/>
+        </w:rPr>
+        <w:t xml:space="preserve"> </w:t>
+      </w:r>
+      <w:proofErr w:type="spellStart"/>
+      <w:r>
+        <w:rPr>
+          <w:b/>
+          <w:bCs/>
+        </w:rPr>
+        <w:t>Temp</w:t>
+      </w:r>
+      <w:proofErr w:type="spellEnd"/>
+      <w:r>
+        <w:rPr>
+          <w:b/>
+          <w:bCs/>
+        </w:rPr>
+        <w:t xml:space="preserve"> Ciclo</w:t>
       </w:r>
       <w:r>
         <w:t>: Suma de las oscilaciones térmicas.</w:t>
@@ -1489,12 +1895,21 @@
           <w:numId w:val="8"/>
         </w:numPr>
       </w:pPr>
-      <w:r>
-        <w:rPr>
-          <w:b/>
-          <w:bCs/>
-        </w:rPr>
-        <w:t>Radicion Solar 0-3</w:t>
+      <w:proofErr w:type="spellStart"/>
+      <w:r>
+        <w:rPr>
+          <w:b/>
+          <w:bCs/>
+        </w:rPr>
+        <w:t>Radicion</w:t>
+      </w:r>
+      <w:proofErr w:type="spellEnd"/>
+      <w:r>
+        <w:rPr>
+          <w:b/>
+          <w:bCs/>
+        </w:rPr>
+        <w:t xml:space="preserve"> Solar 0-3</w:t>
       </w:r>
       <w:r>
         <w:t>: Radiación solar recibida en los últimos 3 meses.</w:t>
@@ -1507,12 +1922,21 @@
           <w:numId w:val="8"/>
         </w:numPr>
       </w:pPr>
-      <w:r>
-        <w:rPr>
-          <w:b/>
-          <w:bCs/>
-        </w:rPr>
-        <w:t>Radiacion Solar Ciclo</w:t>
+      <w:proofErr w:type="spellStart"/>
+      <w:r>
+        <w:rPr>
+          <w:b/>
+          <w:bCs/>
+        </w:rPr>
+        <w:t>Radiacion</w:t>
+      </w:r>
+      <w:proofErr w:type="spellEnd"/>
+      <w:r>
+        <w:rPr>
+          <w:b/>
+          <w:bCs/>
+        </w:rPr>
+        <w:t xml:space="preserve"> Solar Ciclo</w:t>
       </w:r>
       <w:r>
         <w:t>: Radiación solar acumulada en el ciclo.</w:t>
@@ -1525,12 +1949,21 @@
           <w:numId w:val="8"/>
         </w:numPr>
       </w:pPr>
-      <w:r>
-        <w:rPr>
-          <w:b/>
-          <w:bCs/>
-        </w:rPr>
-        <w:t>Precipitacion 0_3</w:t>
+      <w:proofErr w:type="spellStart"/>
+      <w:r>
+        <w:rPr>
+          <w:b/>
+          <w:bCs/>
+        </w:rPr>
+        <w:t>Precipitacion</w:t>
+      </w:r>
+      <w:proofErr w:type="spellEnd"/>
+      <w:r>
+        <w:rPr>
+          <w:b/>
+          <w:bCs/>
+        </w:rPr>
+        <w:t xml:space="preserve"> 0_3</w:t>
       </w:r>
       <w:r>
         <w:t>: Precipitaciones en los últimos 3 meses.</w:t>
@@ -1543,12 +1976,21 @@
           <w:numId w:val="8"/>
         </w:numPr>
       </w:pPr>
-      <w:r>
-        <w:rPr>
-          <w:b/>
-          <w:bCs/>
-        </w:rPr>
-        <w:t>Precipitacion Ciclo</w:t>
+      <w:proofErr w:type="spellStart"/>
+      <w:r>
+        <w:rPr>
+          <w:b/>
+          <w:bCs/>
+        </w:rPr>
+        <w:t>Precipitacion</w:t>
+      </w:r>
+      <w:proofErr w:type="spellEnd"/>
+      <w:r>
+        <w:rPr>
+          <w:b/>
+          <w:bCs/>
+        </w:rPr>
+        <w:t xml:space="preserve"> Ciclo</w:t>
       </w:r>
       <w:r>
         <w:t>: Precipitaciones acumuladas en el ciclo del cultivo.</w:t>
@@ -1561,12 +2003,21 @@
           <w:numId w:val="8"/>
         </w:numPr>
       </w:pPr>
-      <w:r>
-        <w:rPr>
-          <w:b/>
-          <w:bCs/>
-        </w:rPr>
-        <w:t>Evaporacion 0-3</w:t>
+      <w:proofErr w:type="spellStart"/>
+      <w:r>
+        <w:rPr>
+          <w:b/>
+          <w:bCs/>
+        </w:rPr>
+        <w:t>Evaporacion</w:t>
+      </w:r>
+      <w:proofErr w:type="spellEnd"/>
+      <w:r>
+        <w:rPr>
+          <w:b/>
+          <w:bCs/>
+        </w:rPr>
+        <w:t xml:space="preserve"> 0-3</w:t>
       </w:r>
       <w:r>
         <w:t>: Evaporación en los últimos 3 meses.</w:t>
@@ -1579,12 +2030,21 @@
           <w:numId w:val="8"/>
         </w:numPr>
       </w:pPr>
-      <w:r>
-        <w:rPr>
-          <w:b/>
-          <w:bCs/>
-        </w:rPr>
-        <w:t>Evaporacion Ciclo</w:t>
+      <w:proofErr w:type="spellStart"/>
+      <w:r>
+        <w:rPr>
+          <w:b/>
+          <w:bCs/>
+        </w:rPr>
+        <w:t>Evaporacion</w:t>
+      </w:r>
+      <w:proofErr w:type="spellEnd"/>
+      <w:r>
+        <w:rPr>
+          <w:b/>
+          <w:bCs/>
+        </w:rPr>
+        <w:t xml:space="preserve"> Ciclo</w:t>
       </w:r>
       <w:r>
         <w:t>: Evaporación total del ciclo.</w:t>
@@ -3425,6 +3885,7 @@
   <w:style w:type="character" w:default="1" w:styleId="Fuentedeprrafopredeter">
     <w:name w:val="Default Paragraph Font"/>
     <w:uiPriority w:val="1"/>
+    <w:semiHidden/>
     <w:unhideWhenUsed/>
   </w:style>
   <w:style w:type="table" w:default="1" w:styleId="Tablanormal">

</xml_diff>